<commit_message>
Correzioni dopo la revisione: testi d'esempio, CRLF di CLAUDE.md, anno del protocollo
- pulizia preventiva dei testi d'esempio in cerchio1/temi.py, config/temi.toml,
  tests/genera_sintetici.py (sintetici rigenerati), tests/test_catena_simulata.py,
  tests/test_contratto_v1.py: persone, vie e comuni palesemente inventati.
- CLAUDE.md: fini riga CRLF ripristinate, solo le 2 righe di stato in più.
- protocollo: l'anno non si inventa; senza anno certo il numero resta senza "/AAAA"
  e la data è null (anche dal nome del file).
- docs: diario (31-35), stato e consegna (nuova impronta 98c254f94decd91c).

Co-Authored-By: Claude Opus 5.5 <noreply@anthropic.com>
</commit_message>
<xml_diff>
--- a/tests/dati_sintetici/digitali/riscontro_word.docx
+++ b/tests/dati_sintetici/digitali/riscontro_word.docx
@@ -12,20 +12,20 @@
       </w:pPr>
       <w:r>
         <w:rPr/>
-        <w:t>ATS Insubria - Dipartimento Veterinario</w:t>
-      </w:r>
-    </w:p>
-    <w:p>
-      <w:pPr>
-        <w:pStyle w:val="PreformattedText"/>
-        <w:bidi w:val="0"/>
-        <w:spacing w:before="0" w:after="0"/>
-        <w:jc w:val="start"/>
-        <w:rPr/>
-      </w:pPr>
-      <w:r>
-        <w:rPr/>
-        <w:t>Distretto Veterinario di Prato Lungo</w:t>
+        <w:t>ATS di prova - Servizio Veterinario</w:t>
+      </w:r>
+    </w:p>
+    <w:p>
+      <w:pPr>
+        <w:pStyle w:val="PreformattedText"/>
+        <w:bidi w:val="0"/>
+        <w:spacing w:before="0" w:after="0"/>
+        <w:jc w:val="start"/>
+        <w:rPr/>
+      </w:pPr>
+      <w:r>
+        <w:rPr/>
+        <w:t>Distretto di Borgoverde</w:t>
       </w:r>
     </w:p>
     <w:p>
@@ -75,122 +75,109 @@
       </w:pPr>
       <w:r>
         <w:rPr/>
-        <w:t>Alla sig.ra Ernesta Valtorta</w:t>
-      </w:r>
-    </w:p>
-    <w:p>
-      <w:pPr>
-        <w:pStyle w:val="PreformattedText"/>
-        <w:bidi w:val="0"/>
-        <w:spacing w:before="0" w:after="0"/>
-        <w:jc w:val="start"/>
-        <w:rPr/>
-      </w:pPr>
-      <w:r>
-        <w:rPr/>
-        <w:t>via dei Castagni 9 - Prato Lungo</w:t>
-      </w:r>
-    </w:p>
-    <w:p>
-      <w:pPr>
-        <w:pStyle w:val="PreformattedText"/>
-        <w:bidi w:val="0"/>
-        <w:spacing w:before="0" w:after="0"/>
-        <w:jc w:val="start"/>
-        <w:rPr/>
-      </w:pPr>
-      <w:r>
-        <w:rPr/>
-      </w:r>
-    </w:p>
-    <w:p>
-      <w:pPr>
-        <w:pStyle w:val="PreformattedText"/>
-        <w:bidi w:val="0"/>
-        <w:spacing w:before="0" w:after="0"/>
-        <w:jc w:val="start"/>
-        <w:rPr/>
-      </w:pPr>
-      <w:r>
-        <w:rPr/>
-        <w:t>Oggetto: riscontro alla Vs. segnalazione del 12 maggio 2025 - esche avvelenate in via dei Castagni</w:t>
-      </w:r>
-    </w:p>
-    <w:p>
-      <w:pPr>
-        <w:pStyle w:val="PreformattedText"/>
-        <w:bidi w:val="0"/>
-        <w:spacing w:before="0" w:after="0"/>
-        <w:jc w:val="start"/>
-        <w:rPr/>
-      </w:pPr>
-      <w:r>
-        <w:rPr/>
-      </w:r>
-    </w:p>
-    <w:p>
-      <w:pPr>
-        <w:pStyle w:val="PreformattedText"/>
-        <w:bidi w:val="0"/>
-        <w:spacing w:before="0" w:after="0"/>
-        <w:jc w:val="start"/>
-        <w:rPr/>
-      </w:pPr>
-      <w:r>
-        <w:rPr/>
-        <w:t>In riferimento alla segnalazione in oggetto, si comunica che in data 13 maggio 2025 personale</w:t>
-      </w:r>
-    </w:p>
-    <w:p>
-      <w:pPr>
-        <w:pStyle w:val="PreformattedText"/>
-        <w:bidi w:val="0"/>
-        <w:spacing w:before="0" w:after="0"/>
-        <w:jc w:val="start"/>
-        <w:rPr/>
-      </w:pPr>
-      <w:r>
-        <w:rPr/>
-        <w:t>del Servizio Veterinario ha effettuato un sopralluogo nel parco di via dei Castagni insieme alla</w:t>
-      </w:r>
-    </w:p>
-    <w:p>
-      <w:pPr>
-        <w:pStyle w:val="PreformattedText"/>
-        <w:bidi w:val="0"/>
-        <w:spacing w:before="0" w:after="0"/>
-        <w:jc w:val="start"/>
-        <w:rPr/>
-      </w:pPr>
-      <w:r>
-        <w:rPr/>
-        <w:t>Polizia Locale. Sono stati raccolti e inviati all'Istituto Zooprofilattico i bocconi rinvenuti</w:t>
-      </w:r>
-    </w:p>
-    <w:p>
-      <w:pPr>
-        <w:pStyle w:val="PreformattedText"/>
-        <w:bidi w:val="0"/>
-        <w:spacing w:before="0" w:after="0"/>
-        <w:jc w:val="start"/>
-        <w:rPr/>
-      </w:pPr>
-      <w:r>
-        <w:rPr/>
-        <w:t>lungo la recinzione e la carcassa di uno dei gatti della colonia. Il Comune ha disposto la</w:t>
-      </w:r>
-    </w:p>
-    <w:p>
-      <w:pPr>
-        <w:pStyle w:val="PreformattedText"/>
-        <w:bidi w:val="0"/>
-        <w:spacing w:before="0" w:after="0"/>
-        <w:jc w:val="start"/>
-        <w:rPr/>
-      </w:pPr>
-      <w:r>
-        <w:rPr/>
-        <w:t>chiusura temporanea del parco e la bonifica dell'area.</w:t>
+        <w:t>Alla sig.ra Anna Esempio</w:t>
+      </w:r>
+    </w:p>
+    <w:p>
+      <w:pPr>
+        <w:pStyle w:val="PreformattedText"/>
+        <w:bidi w:val="0"/>
+        <w:spacing w:before="0" w:after="0"/>
+        <w:jc w:val="start"/>
+        <w:rPr/>
+      </w:pPr>
+      <w:r>
+        <w:rPr/>
+        <w:t>via delle Prove 9 - Borgoverde</w:t>
+      </w:r>
+    </w:p>
+    <w:p>
+      <w:pPr>
+        <w:pStyle w:val="PreformattedText"/>
+        <w:bidi w:val="0"/>
+        <w:spacing w:before="0" w:after="0"/>
+        <w:jc w:val="start"/>
+        <w:rPr/>
+      </w:pPr>
+      <w:r>
+        <w:rPr/>
+      </w:r>
+    </w:p>
+    <w:p>
+      <w:pPr>
+        <w:pStyle w:val="PreformattedText"/>
+        <w:bidi w:val="0"/>
+        <w:spacing w:before="0" w:after="0"/>
+        <w:jc w:val="start"/>
+        <w:rPr/>
+      </w:pPr>
+      <w:r>
+        <w:rPr/>
+        <w:t>Oggetto: riscontro alla Vs. segnalazione del 12 maggio 2025 - veleno per gatti in via delle Prove</w:t>
+      </w:r>
+    </w:p>
+    <w:p>
+      <w:pPr>
+        <w:pStyle w:val="PreformattedText"/>
+        <w:bidi w:val="0"/>
+        <w:spacing w:before="0" w:after="0"/>
+        <w:jc w:val="start"/>
+        <w:rPr/>
+      </w:pPr>
+      <w:r>
+        <w:rPr/>
+      </w:r>
+    </w:p>
+    <w:p>
+      <w:pPr>
+        <w:pStyle w:val="PreformattedText"/>
+        <w:bidi w:val="0"/>
+        <w:spacing w:before="0" w:after="0"/>
+        <w:jc w:val="start"/>
+        <w:rPr/>
+      </w:pPr>
+      <w:r>
+        <w:rPr/>
+        <w:t>In riferimento alla segnalazione in oggetto, si comunica che in data 13 maggio 2025 il</w:t>
+      </w:r>
+    </w:p>
+    <w:p>
+      <w:pPr>
+        <w:pStyle w:val="PreformattedText"/>
+        <w:bidi w:val="0"/>
+        <w:spacing w:before="0" w:after="0"/>
+        <w:jc w:val="start"/>
+        <w:rPr/>
+      </w:pPr>
+      <w:r>
+        <w:rPr/>
+        <w:t>Servizio Veterinario ha fatto un sopralluogo nel cortile di via delle Prove insieme alla</w:t>
+      </w:r>
+    </w:p>
+    <w:p>
+      <w:pPr>
+        <w:pStyle w:val="PreformattedText"/>
+        <w:bidi w:val="0"/>
+        <w:spacing w:before="0" w:after="0"/>
+        <w:jc w:val="start"/>
+        <w:rPr/>
+      </w:pPr>
+      <w:r>
+        <w:rPr/>
+        <w:t>Polizia Locale. I pezzi di carne trovati vicino al muro e uno dei gatti morti sono stati</w:t>
+      </w:r>
+    </w:p>
+    <w:p>
+      <w:pPr>
+        <w:pStyle w:val="PreformattedText"/>
+        <w:bidi w:val="0"/>
+        <w:spacing w:before="0" w:after="0"/>
+        <w:jc w:val="start"/>
+        <w:rPr/>
+      </w:pPr>
+      <w:r>
+        <w:rPr/>
+        <w:t>inviati al laboratorio per le analisi. Il Comune ha disposto la pulizia del cortile.</w:t>
       </w:r>
     </w:p>
     <w:p>

</xml_diff>